<commit_message>
Expand second chapter draft
</commit_message>
<xml_diff>
--- a/本科毕业设计（论文）优化扩写稿.docx
+++ b/本科毕业设计（论文）优化扩写稿.docx
@@ -346,19 +346,27 @@
       </w:r>
     </w:p>
     <w:p>
-      <w:pPr>
-        <w:ind w:firstLine="480"/>
-      </w:pPr>
+      <w:pPr/>
       <w:r>
-        <w:t>实验系统主要由液滴生成系统、加热倾斜壁面系统、高速摄像系统、照明系统和图像采集处理系统组成。液滴生成系统通过针头或毛细管形成稳定单液滴，使液滴在重力作用下下落并撞击加热壁面。加热壁面采用不锈钢片或等效金属片模拟交混翼片表面，通过电加热方式控制壁面温度。壁面保持一定倾角，以体现交混翼片局部倾斜几何特征。</w:t>
+        <w:t>本研究围绕“单液滴—高温倾斜壁面—瞬态可视化”这一主线开展实验设计。实验系统主要由液滴生成系统、加热倾斜壁面系统、高速摄像系统、照明系统、温度测量与控制系统以及图像采集处理系统组成。各部分相互配合，用于实现液滴初始状态可控、壁面热状态稳定、撞击过程清晰记录和后续参数可重复提取。实验技术路线可概括为：首先生成尺寸相对稳定的单液滴并控制其释放高度；随后使液滴在重力作用下撞击设定温度和倾角的金属壁面；最后利用高速图像记录撞击、铺展、破碎、弹跳和射流等瞬态过程，并通过图像处理获得定量参数。</w:t>
       </w:r>
     </w:p>
     <w:p>
-      <w:pPr>
-        <w:ind w:firstLine="480"/>
-      </w:pPr>
+      <w:pPr/>
       <w:r>
-        <w:t>高速摄像机布置于壁面侧向，用于记录液滴撞击前后的形态变化。背光照明用于增强液滴边界对比度，保证后续图像分割能够准确识别液滴轮廓。实验前需对摄像系统进行空间标定，将像素尺度转换为实际长度尺度。每组工况下记录多次重复实验，以降低偶然误差对现象判断和统计结果的影响。</w:t>
+        <w:t>液滴生成系统通过针头或毛细管形成稳定单液滴。实验前需保持供液压力或注射流量稳定，使液滴在针头端部缓慢增长并自然脱落，从而减少初始扰动对撞击形态的影响。液滴脱落后在空气中下落，其撞击速度主要由释放高度决定；在不同工况下，可通过调整针头与壁面之间的距离获得不同韦伯数范围。为保证实验重复性，应尽量保持针头位置、液滴释放方式和液体物性一致，并在正式采集前排除针头挂液、液滴连发或液滴偏移等异常情况。</w:t>
+      </w:r>
+    </w:p>
+    <w:p>
+      <w:pPr/>
+      <w:r>
+        <w:t>加热倾斜壁面系统用于模拟交混翼片的局部高温倾斜表面。壁面材料可采用不锈钢片或等效金属片，其导热性能、表面状态和机械强度应满足高温加热及重复撞击实验要求。金属片通过电加热方式升温，并配合温度传感器监测壁面温度。由于液滴撞击行为对壁温变化十分敏感，尤其在过渡沸腾区，微小温度差异可能导致破碎模式改变，因此实验中应在壁温达到设定值并保持相对稳定后再释放液滴。壁面保持一定倾角，用以体现交混翼片局部倾斜几何特征，使液滴撞击后同时具有法向铺展和切向滑移过程。</w:t>
+      </w:r>
+    </w:p>
+    <w:p>
+      <w:pPr/>
+      <w:r>
+        <w:t>高速摄像机布置于壁面侧向或略偏法向的位置，用于记录液滴撞击前后的形态变化。相机视场应覆盖液滴下落末段、撞击区域以及次级液滴主要喷射范围，帧率和曝光时间需要满足捕捉液膜快速铺展、边缘破碎和射流断裂等瞬态现象的要求。照明系统采用背光或强平行光照明，以增强液滴与背景之间的灰度差异，保证后续图像分割能够准确识别液滴轮廓。实验前需利用标定尺对摄像系统进行空间标定，将像素尺度转换为实际长度尺度；每组工况下记录多次重复实验，以降低偶然误差对现象判断和统计结果的影响。</w:t>
       </w:r>
     </w:p>
     <w:p>
@@ -378,35 +386,33 @@
       </w:r>
     </w:p>
     <w:p>
-      <w:pPr>
-        <w:ind w:firstLine="480"/>
-      </w:pPr>
+      <w:pPr/>
       <w:r>
-        <w:t>初始液滴直径通过撞击前若干帧图像中的液滴投影面积或等效圆直径计算得到。若液滴近似球形，可将投影面积换算为等效直径；若液滴受空气阻力产生轻微变形，则可取长轴和短轴的几何平均值作为等效直径。撞击速度通过液滴质心在连续帧中的位移除以时间间隔获得。为减少单帧识别误差，通常选取撞击前一段稳定下落区间进行线性拟合，拟合斜率作为撞击速度。</w:t>
+        <w:t>初始液滴直径通过撞击前若干帧图像中的液滴投影面积或等效圆直径计算得到。若液滴在下落过程中近似球形，可由投影面积换算为等效直径；若液滴受空气阻力或释放扰动影响产生轻微变形，则可分别测量液滴长轴和短轴，并取二者的几何平均值作为等效直径。为减小单帧识别误差，直径统计不宜只依赖某一帧图像，而应选取撞击前形态稳定的多帧图像求平均值。对于边缘模糊或光斑干扰明显的图像，应结合原始图像与二值图像进行人工复核，避免将阴影或反光误识别为液滴边界。</w:t>
       </w:r>
     </w:p>
     <w:p>
-      <w:pPr>
-        <w:ind w:firstLine="480"/>
-      </w:pPr>
+      <w:pPr/>
       <w:r>
-        <w:t>韦伯数用于表征液滴惯性力与表面张力的相对大小，定义为：</w:t>
+        <w:t>撞击速度通过液滴质心在连续帧中的位移除以时间间隔获得。具体处理时，可先对撞击前若干帧图像进行阈值分割，提取液滴区域并计算质心坐标，再根据相邻帧质心位置变化得到瞬时速度。为减少单帧噪声和质心抖动的影响，通常选取撞击前一段稳定下落区间进行线性拟合，拟合直线斜率作为撞击速度。若液滴轨迹存在轻微倾斜，应分别计算法向速度分量和切向速度分量，其中法向分量主要决定液滴压缩蒸汽膜和铺展变形的强度，切向分量则影响倾斜壁面上的滑移距离和非对称铺展程度。</w:t>
       </w:r>
     </w:p>
     <w:p>
-      <w:pPr>
-        <w:jc w:val="center"/>
-      </w:pPr>
+      <w:pPr/>
+      <w:r>
+        <w:t>韦伯数用于表征液滴惯性力与表面张力的相对大小，是本文划分和比较不同撞击工况的重要无量纲参数，定义为：</w:t>
+      </w:r>
+    </w:p>
+    <w:p>
+      <w:pPr/>
       <w:r>
         <w:t>We=\frac{\rho_l U_0^2 D_0}{\sigma}</w:t>
       </w:r>
     </w:p>
     <w:p>
-      <w:pPr>
-        <w:ind w:firstLine="480"/>
-      </w:pPr>
+      <w:pPr/>
       <w:r>
-        <w:t>式中，\(\rho_l\) 为液体密度，\(U_0\) 为撞击速度，\(D_0\) 为初始液滴直径，\(\sigma\) 为表面张力。韦伯数越大，液滴撞击惯性越强，铺展程度和破碎倾向通常越明显。</w:t>
+        <w:t>式中，\(\rho_l\) 为液体密度，\(U_0\) 为撞击速度，\(D_0\) 为初始液滴直径，\(\sigma\) 为表面张力。韦伯数越大，液滴撞击惯性越强，铺展液膜越薄，边缘拉伸和破碎倾向通常越明显。对于高温倾斜壁面，韦伯数不仅影响液滴是否发生破碎，也会改变蒸汽膜受到的瞬时压缩程度，因此是分析动态 Leidenfrost 转变和二次雾化强度的重要参数。</w:t>
       </w:r>
     </w:p>
     <w:p>
@@ -418,19 +424,21 @@
       </w:r>
     </w:p>
     <w:p>
-      <w:pPr>
-        <w:ind w:firstLine="480"/>
-      </w:pPr>
+      <w:pPr/>
       <w:r>
-        <w:t>次级液滴统计采用图像阈值分割与机器学习分割相结合的方法。首先对图像进行背景扣除、灰度增强和噪声滤波，提高液滴边界清晰度；随后利用 Fiji-Weka 对液滴区域、背景区域及阴影区域进行分类，获得二值化液滴掩膜；最后通过连通域识别得到次级液滴数量、投影面积和等效直径。</w:t>
+        <w:t>次级液滴统计采用图像阈值分割与机器学习分割相结合的方法。首先对原始图像进行背景扣除、灰度增强、对比度调整和噪声滤波，提高液滴边界与背景之间的区分度；随后利用 Fiji-Weka 对液滴区域、背景区域、阴影区域和反光区域进行分类训练，获得较稳定的二值化液滴掩膜；最后通过连通域识别得到次级液滴数量、投影面积、等效直径和空间分布。对于明显相连但物理上已经分离的液滴，可结合形态学分割或人工校核进行修正，以减少粘连区域造成的面积高估。</w:t>
       </w:r>
     </w:p>
     <w:p>
-      <w:pPr>
-        <w:ind w:firstLine="480"/>
-      </w:pPr>
+      <w:pPr/>
       <w:r>
-        <w:t>由于高速图像记录的是二维投影，液滴重叠、离焦和景深效应会导致小液滴漏检或面积低估。因此，数据分析中应将粒径分布和表面积放大倍数理解为基于图像可识别液滴的表观统计结果。对不同工况进行比较时，应保持相同的光学设置、分割阈值和统计规则，以保证相对趋势具有可比性。</w:t>
+        <w:t>次级液滴的统计时刻应根据研究目标统一确定。若关注最大雾化程度，可选取液滴破碎后次级液滴数量最多且边界清晰的一帧；若关注时间演化过程，则可对多个连续时刻进行统计，分析液滴数量和粒径随时间的变化。本文主要服务于不同壁温和韦伯数条件下雾化效果的横向比较，因此在处理各组工况时应保持相同的取帧原则、分割参数和最小可识别粒径阈值。对于过小、离焦或与背景对比度不足的液滴，应在统计规则中统一说明，以保证不同工况之间的相对趋势具有可比性。</w:t>
+      </w:r>
+    </w:p>
+    <w:p>
+      <w:pPr/>
+      <w:r>
+        <w:t>由于高速图像记录的是二维投影，液滴重叠、离焦、景深效应和遮挡现象会导致小液滴漏检或面积低估。因此，数据分析中应将粒径分布和表面积放大倍数理解为基于图像可识别液滴的表观统计结果。尽管该方法难以完全还原三维液滴群的真实空间分布，但在光学条件、分割方法和统计规则一致的前提下，仍可有效反映不同沸腾状态和不同韦伯数下液滴破碎强弱的相对变化。</w:t>
       </w:r>
     </w:p>
     <w:p>
@@ -450,11 +458,21 @@
       </w:r>
     </w:p>
     <w:p>
-      <w:pPr>
-        <w:ind w:firstLine="480"/>
-      </w:pPr>
+      <w:pPr/>
       <w:r>
-        <w:t>根据液滴与壁面之间的热接触状态，可将实验现象划分为核态沸腾、过渡沸腾和膜态沸腾。核态沸腾表现为液滴与壁面直接接触，底部气泡连续生成并破裂，液滴整体仍保持附着或缓慢蒸发；过渡沸腾表现为局部接触和局部蒸汽隔离交替出现，液滴常发生剧烈破碎、边缘剥离或不规则弹跳；膜态沸腾表现为连续蒸汽膜支撑液滴，液滴与壁面基本隔离，可出现完整弹跳、膜态飞溅和中心射流。</w:t>
+        <w:t>根据液滴与壁面之间的热接触状态，可将实验现象划分为核态沸腾、过渡沸腾和膜态沸腾三个主要区域。核态沸腾表现为液滴与壁面保持直接接触，底部气泡连续生成并破裂，液滴整体仍附着于壁面或沿倾斜方向缓慢滑移，次级液滴数量相对较少。该区域内液滴与壁面换热较充分，气泡扰动会增强局部蒸发，但通常不足以使液滴整体发生剧烈破碎。</w:t>
+      </w:r>
+    </w:p>
+    <w:p>
+      <w:pPr/>
+      <w:r>
+        <w:t>过渡沸腾表现为局部固-液接触和局部蒸汽隔离交替出现，是液滴形态最不稳定、破碎最强烈的区域。液滴撞击后先在惯性作用下快速铺展为薄液膜，随后局部接触区发生强烈汽化，气泡爆发、液膜穿孔、边缘剥离和不规则弹跳可能同时出现。由于倾斜壁面上液膜厚度分布不均，上游薄液膜区更容易被蒸汽压力撕裂，下游厚液膜区则可能形成较大液团或滑移残留，因此过渡沸腾下的次级液滴粒径分布通常较宽。</w:t>
+      </w:r>
+    </w:p>
+    <w:p>
+      <w:pPr/>
+      <w:r>
+        <w:t>膜态沸腾表现为液滴底部形成连续蒸汽膜，固-液直接接触显著减少，液滴主要在蒸汽膜支撑下完成铺展、回缩、弹跳或滑移。在较低韦伯数下，液滴可保持较完整形态并整体弹起；在较高韦伯数或较高壁温下，薄液膜可能在蒸汽膜非均匀压力作用下发生膜态飞溅，或在局部压力汇聚与回缩流动汇聚作用下形成中心射流。由此可见，膜态沸腾并不必然意味着无破碎，而是其破碎机制由直接接触汽化转变为蒸汽膜支撑条件下的液膜失稳和射流断裂。</w:t>
       </w:r>
     </w:p>
     <w:p>
@@ -466,11 +484,21 @@
       </w:r>
     </w:p>
     <w:p>
-      <w:pPr>
-        <w:ind w:firstLine="480"/>
-      </w:pPr>
+      <w:pPr/>
       <w:r>
-        <w:t>沸腾状态判定主要依据高速图像中的三个特征：第一，液滴底部是否存在持续固-液接触；第二，液滴是否形成整体弹跳或稳定滑移，表明蒸汽膜已具有支撑能力；第三，次级液滴产生位置和产生方式是否由气泡爆发、边缘剥离或射流断裂主导。结合壁面温度和韦伯数，可在温度-韦伯数坐标中标注各现象点，进而得到不同沸腾状态的相区边界。</w:t>
+        <w:t>实验工况主要由壁面温度和液滴撞击韦伯数共同确定。壁面温度决定蒸汽生成率、蒸汽膜厚度和固-液接触可能性，是区分不同沸腾状态的主要热力学条件；韦伯数反映液滴撞击惯性，决定液滴铺展程度、蒸汽膜压缩强度和边缘破碎趋势。通过在不同壁温和不同释放高度下开展实验，可获得温度—韦伯数坐标中的现象分布，并进一步构建液滴撞击高温倾斜壁面的沸腾状态相图。</w:t>
+      </w:r>
+    </w:p>
+    <w:p>
+      <w:pPr/>
+      <w:r>
+        <w:t>沸腾状态判定主要依据高速图像中的三个特征。第一，观察液滴底部是否存在持续固-液接触以及接触区是否伴随气泡生成和破裂；若液滴长期附着或缓慢蒸发，则更接近核态沸腾。第二，观察液滴是否形成整体弹跳或稳定滑移；若液滴主体能够被蒸汽层托举并脱离壁面，说明蒸汽膜已具有一定支撑能力。第三，分析次级液滴产生位置和产生方式；若次级液滴主要由底部气泡爆发和液膜穿孔产生，可归入过渡沸腾主导的破碎雾化；若主要由中心射流断裂或蒸汽膜上薄液膜失稳产生，则更接近膜态沸腾机制。</w:t>
+      </w:r>
+    </w:p>
+    <w:p>
+      <w:pPr/>
+      <w:r>
+        <w:t>在实际判定中，部分工况可能处于两种沸腾状态的过渡边界，单次实验现象具有一定随机性。因此，应结合多次重复实验的主要现象进行归类，而不宜仅凭单次图像作出判断。对于同一壁温和韦伯数下出现多种行为的情况，可记录其出现概率，并在相图中标注为过渡区域。这样既能保持分类结果的清晰性，也能反映高温液滴撞击过程本身的随机性和敏感性。</w:t>
       </w:r>
     </w:p>
     <w:p>
@@ -482,11 +510,21 @@
       </w:r>
     </w:p>
     <w:p>
-      <w:pPr>
-        <w:ind w:firstLine="480"/>
-      </w:pPr>
+      <w:pPr/>
       <w:r>
-        <w:t>实验不确定度主要来源于温度测量、图像标定、液滴边界识别和重复性波动。温度不确定度会影响相区边界判断，尤其在过渡沸腾附近，较小温度差异即可导致现象转变。图像标定误差会直接传递到液滴直径、速度和表面积计算中。边界识别误差对小液滴统计影响更大，因为小液滴像素数量少，轻微阈值变化即可造成直径和面积明显偏差。重复实验可用于评估同一工况下现象概率和统计参数离散程度。</w:t>
+        <w:t>实验不确定度主要来源于温度测量、图像标定、液滴边界识别、速度拟合、次级液滴分割和重复性波动。温度测量误差会直接影响相区边界判断，尤其在过渡沸腾附近，较小温度差异即可导致液滴由破碎雾化转变为弹跳雾化或膜态弹跳。除传感器精度外，壁面温度的空间非均匀性也需要关注，因为液滴实际撞击区域的温度可能与测点温度存在差异。实验中应尽量使撞击位置固定，并在壁温稳定后进行采集，以降低温度波动带来的影响。</w:t>
+      </w:r>
+    </w:p>
+    <w:p>
+      <w:pPr/>
+      <w:r>
+        <w:t>图像标定误差会传递到液滴直径、速度、投影面积和表面积计算中。若标定尺与液滴运动平面不完全重合，或相机镜头存在畸变，像素—长度换算关系将产生系统偏差。液滴边界识别误差对小液滴统计影响更大，因为小液滴像素数量少，轻微阈值变化即可造成直径和面积明显偏差。对于次级液滴数量较多的破碎雾化工况，液滴重叠和离焦还会增加漏检概率，从而使总表面积放大倍数偏低。</w:t>
+      </w:r>
+    </w:p>
+    <w:p>
+      <w:pPr/>
+      <w:r>
+        <w:t>速度拟合的不确定度主要来自帧率、质心定位和取帧区间选择。若撞击前液滴发生摆动或受气流扰动，质心轨迹可能偏离直线，导致速度拟合结果波动。为提高可靠性，可在稳定下落区间内采用多帧线性拟合，并对异常帧进行剔除。重复实验可用于评估同一工况下现象概率和统计参数离散程度，最终结果宜以平均值或典型值表示，并结合标准差或误差范围说明数据可靠性。</w:t>
       </w:r>
     </w:p>
     <w:p>
@@ -498,11 +536,15 @@
       </w:r>
     </w:p>
     <w:p>
-      <w:pPr>
-        <w:ind w:firstLine="480"/>
-      </w:pPr>
+      <w:pPr/>
       <w:r>
-        <w:t>本章介绍了单液滴撞击高温倾斜壁面的实验系统和图像处理方法，明确了初始液滴参数、次级液滴统计参数和沸腾状态判定准则。该方法为后续分析液滴动力学行为、建立温度-韦伯数相图以及比较不同雾化模式提供了数据基础。</w:t>
+        <w:t>本章在保持原有实验思路的基础上，对单液滴撞击高温倾斜壁面的实验装置、图像处理流程、参数提取方法、沸腾状态判定准则和不确定度来源进行了说明。实验系统通过液滴生成、壁面加热、高速成像和背光照明实现撞击过程的可视化记录；图像处理方法则用于提取初始液滴直径、撞击速度、韦伯数、次级液滴数量和等效直径等关键参数。</w:t>
+      </w:r>
+    </w:p>
+    <w:p>
+      <w:pPr/>
+      <w:r>
+        <w:t>通过建立统一的取帧、分割和统计规则，本文能够对不同壁温和韦伯数条件下的液滴行为进行横向比较。沸腾状态判定以固-液接触状态、蒸汽膜支撑能力和次级液滴形成机制为主要依据，可为后续构建温度—韦伯数相图、分析液滴动力学行为以及比较过渡沸腾破碎雾化与膜态沸腾中心射流两类雾化模式提供方法基础。</w:t>
       </w:r>
     </w:p>
     <w:p>

</xml_diff>